<commit_message>
UniWeb publish 2026-10-11 17:00:28 CST
</commit_message>
<xml_diff>
--- a/QH-2026F-v5-x10_en/20261002-W5課程-v3.docx
+++ b/QH-2026F-v5-x10_en/20261002-W5課程-v3.docx
@@ -444,7 +444,7 @@
               <w:rPr>
                 <w:noProof/>
               </w:rPr>
-              <w:pict w14:anchorId="4DF9537A">
+              <w:pict w14:anchorId="5625B748">
                 <v:rect id="_x0000_i1032" alt="" style="width:415.3pt;height:.05pt;mso-width-percent:0;mso-height-percent:0;mso-width-percent:0;mso-height-percent:0" o:hralign="center" o:hrstd="t" o:hr="t" fillcolor="#a0a0a0" stroked="f"/>
               </w:pict>
             </w:r>
@@ -531,7 +531,7 @@
               <w:rPr>
                 <w:noProof/>
               </w:rPr>
-              <w:pict w14:anchorId="3E5CA57F">
+              <w:pict w14:anchorId="16740D2E">
                 <v:rect id="_x0000_i1031" alt="" style="width:415.3pt;height:.05pt;mso-width-percent:0;mso-height-percent:0;mso-width-percent:0;mso-height-percent:0" o:hralign="center" o:hrstd="t" o:hr="t" fillcolor="#a0a0a0" stroked="f"/>
               </w:pict>
             </w:r>
@@ -653,7 +653,7 @@
               <w:rPr>
                 <w:noProof/>
               </w:rPr>
-              <w:pict w14:anchorId="63D715FF">
+              <w:pict w14:anchorId="09FDB67A">
                 <v:rect id="_x0000_i1030" alt="" style="width:415.3pt;height:.05pt;mso-width-percent:0;mso-height-percent:0;mso-width-percent:0;mso-height-percent:0" o:hralign="center" o:hrstd="t" o:hr="t" fillcolor="#a0a0a0" stroked="f"/>
               </w:pict>
             </w:r>
@@ -1023,7 +1023,7 @@
           </w:p>
           <w:p>
             <w:r>
-              <w:pict w14:anchorId="790A00F1">
+              <w:pict w14:anchorId="05E0FB8A">
                 <v:rect id="Horizontal Line 4" o:spid="_x0000_s1026" alt="" style="width:523pt;height:.1pt;visibility:visible;mso-wrap-style:square;mso-width-percent:0;mso-height-percent:0;mso-left-percent:-10001;mso-top-percent:-10001;mso-position-horizontal:absolute;mso-position-horizontal-relative:char;mso-position-vertical:absolute;mso-position-vertical-relative:line;mso-width-percent:0;mso-height-percent:0;mso-left-percent:-10001;mso-top-percent:-10001;v-text-anchor:top" filled="f">
                   <o:lock v:ext="edit" aspectratio="t" verticies="t" text="t" shapetype="t"/>
                   <w10:wrap type="none"/>
@@ -1051,7 +1051,7 @@
                 <w:noProof/>
               </w:rPr>
               <w:lastRenderedPageBreak/>
-              <w:pict w14:anchorId="5C5C6046">
+              <w:pict w14:anchorId="738CC887">
                 <v:rect id="_x0000_i1028" alt="" style="width:415.3pt;height:.05pt;mso-width-percent:0;mso-height-percent:0;mso-width-percent:0;mso-height-percent:0" o:hralign="center" o:hrstd="t" o:hr="t" fillcolor="#a0a0a0" stroked="f"/>
               </w:pict>
             </w:r>
@@ -1514,6 +1514,9 @@
                   </m:e>
                 </m:borderBox>
                 <m:r>
+                  <m:rPr>
+                    <m:sty m:val="p"/>
+                  </m:rPr>
                   <w:br/>
                 </m:r>
               </m:oMath>
@@ -1525,6 +1528,9 @@
                   <m:t>↓</m:t>
                 </m:r>
                 <m:r>
+                  <m:rPr>
+                    <m:sty m:val="p"/>
+                  </m:rPr>
                   <w:br/>
                 </m:r>
               </m:oMath>
@@ -1539,6 +1545,9 @@
                   <m:t>pulse sequencer / FPGA / AWG</m:t>
                 </m:r>
                 <m:r>
+                  <m:rPr>
+                    <m:sty m:val="p"/>
+                  </m:rPr>
                   <w:br/>
                 </m:r>
               </m:oMath>
@@ -1550,6 +1559,9 @@
                   <m:t>↓</m:t>
                 </m:r>
                 <m:r>
+                  <m:rPr>
+                    <m:sty m:val="p"/>
+                  </m:rPr>
                   <w:br/>
                 </m:r>
               </m:oMath>
@@ -1561,6 +1573,9 @@
                   <m:t>I(t),Q(t)</m:t>
                 </m:r>
                 <m:r>
+                  <m:rPr>
+                    <m:sty m:val="p"/>
+                  </m:rPr>
                   <w:br/>
                 </m:r>
               </m:oMath>
@@ -1572,6 +1587,9 @@
                   <m:t>↓</m:t>
                 </m:r>
                 <m:r>
+                  <m:rPr>
+                    <m:sty m:val="p"/>
+                  </m:rPr>
                   <w:br/>
                 </m:r>
               </m:oMath>
@@ -1604,6 +1622,9 @@
                   <m:t>or modern direct-RF DAC/RFSoC</m:t>
                 </m:r>
                 <m:r>
+                  <m:rPr>
+                    <m:sty m:val="p"/>
+                  </m:rPr>
                   <w:br/>
                 </m:r>
               </m:oMath>
@@ -1615,6 +1636,9 @@
                   <m:t>↓</m:t>
                 </m:r>
                 <m:r>
+                  <m:rPr>
+                    <m:sty m:val="p"/>
+                  </m:rPr>
                   <w:br/>
                 </m:r>
               </m:oMath>
@@ -1685,6 +1709,9 @@
                   <m:t>t+ϕ(t)]</m:t>
                 </m:r>
                 <m:r>
+                  <m:rPr>
+                    <m:sty m:val="p"/>
+                  </m:rPr>
                   <w:br/>
                 </m:r>
               </m:oMath>
@@ -1696,6 +1723,9 @@
                   <m:t>↓</m:t>
                 </m:r>
                 <m:r>
+                  <m:rPr>
+                    <m:sty m:val="p"/>
+                  </m:rPr>
                   <w:br/>
                 </m:r>
               </m:oMath>
@@ -1710,6 +1740,9 @@
                   <m:t>attenuation / filtering / cryostat</m:t>
                 </m:r>
                 <m:r>
+                  <m:rPr>
+                    <m:sty m:val="p"/>
+                  </m:rPr>
                   <w:br/>
                 </m:r>
               </m:oMath>
@@ -1721,6 +1754,9 @@
                   <m:t>↓</m:t>
                 </m:r>
                 <m:r>
+                  <m:rPr>
+                    <m:sty m:val="p"/>
+                  </m:rPr>
                   <w:br/>
                 </m:r>
               </m:oMath>
@@ -2646,7 +2682,7 @@
               <w:rPr>
                 <w:noProof/>
               </w:rPr>
-              <w:pict w14:anchorId="2D2F4DC1">
+              <w:pict w14:anchorId="21505BBE">
                 <v:rect id="_x0000_i1027" alt="" style="width:415.3pt;height:.05pt;mso-width-percent:0;mso-height-percent:0;mso-width-percent:0;mso-height-percent:0" o:hralign="center" o:hrstd="t" o:hr="t" fillcolor="#a0a0a0" stroked="f"/>
               </w:pict>
             </w:r>
@@ -2656,7 +2692,7 @@
               <w:rPr>
                 <w:noProof/>
               </w:rPr>
-              <w:pict w14:anchorId="7EFBE5F9">
+              <w:pict w14:anchorId="217F8B00">
                 <v:rect id="_x0000_i1026" alt="" style="width:415.3pt;height:.05pt;mso-width-percent:0;mso-height-percent:0;mso-width-percent:0;mso-height-percent:0" o:hralign="center" o:hrstd="t" o:hr="t" fillcolor="#a0a0a0" stroked="f"/>
               </w:pict>
             </w:r>
@@ -2666,7 +2702,7 @@
               <w:rPr>
                 <w:noProof/>
               </w:rPr>
-              <w:pict w14:anchorId="6ED66387">
+              <w:pict w14:anchorId="68E7BBC5">
                 <v:rect id="_x0000_i1025" alt="" style="width:415.3pt;height:.05pt;mso-width-percent:0;mso-height-percent:0;mso-width-percent:0;mso-height-percent:0" o:hralign="center" o:hrstd="t" o:hr="t" fillcolor="#a0a0a0" stroked="f"/>
               </w:pict>
             </w:r>
@@ -3046,6 +3082,9 @@
             <m:t>.</m:t>
           </m:r>
           <m:r>
+            <m:rPr>
+              <m:sty m:val="p"/>
+            </m:rPr>
             <w:br/>
           </m:r>
         </m:oMath>
@@ -3500,6 +3539,9 @@
             <m:t>.</m:t>
           </m:r>
           <m:r>
+            <m:rPr>
+              <m:sty m:val="p"/>
+            </m:rPr>
             <w:br/>
           </m:r>
         </m:oMath>
@@ -3867,6 +3909,9 @@
             </m:sub>
           </m:sSub>
           <m:r>
+            <m:rPr>
+              <m:sty m:val="p"/>
+            </m:rPr>
             <w:br/>
           </m:r>
         </m:oMath>
@@ -4070,6 +4115,9 @@
             </m:e>
           </m:d>
           <m:r>
+            <m:rPr>
+              <m:sty m:val="p"/>
+            </m:rPr>
             <w:br/>
           </m:r>
         </m:oMath>
@@ -5247,6 +5295,9 @@
             <m:t>.</m:t>
           </m:r>
           <m:r>
+            <m:rPr>
+              <m:sty m:val="p"/>
+            </m:rPr>
             <w:br/>
           </m:r>
         </m:oMath>
@@ -6291,6 +6342,9 @@
             </m:sub>
           </m:sSub>
           <m:r>
+            <m:rPr>
+              <m:sty m:val="p"/>
+            </m:rPr>
             <w:br/>
           </m:r>
         </m:oMath>
@@ -6497,6 +6551,9 @@
             </m:sup>
           </m:sSubSup>
           <m:r>
+            <m:rPr>
+              <m:sty m:val="p"/>
+            </m:rPr>
             <w:br/>
           </m:r>
         </m:oMath>
@@ -6921,6 +6978,9 @@
             </m:den>
           </m:f>
           <m:r>
+            <m:rPr>
+              <m:sty m:val="p"/>
+            </m:rPr>
             <w:br/>
           </m:r>
         </m:oMath>
@@ -7440,6 +7500,9 @@
             </m:den>
           </m:f>
           <m:r>
+            <m:rPr>
+              <m:sty m:val="p"/>
+            </m:rPr>
             <w:br/>
           </m:r>
         </m:oMath>
@@ -7585,6 +7648,9 @@
             </m:den>
           </m:f>
           <m:r>
+            <m:rPr>
+              <m:sty m:val="p"/>
+            </m:rPr>
             <w:br/>
           </m:r>
         </m:oMath>
@@ -7840,6 +7906,9 @@
             </m:den>
           </m:f>
           <m:r>
+            <m:rPr>
+              <m:sty m:val="p"/>
+            </m:rPr>
             <w:br/>
           </m:r>
         </m:oMath>
@@ -8277,6 +8346,9 @@
             <m:t>)</m:t>
           </m:r>
           <m:r>
+            <m:rPr>
+              <m:sty m:val="p"/>
+            </m:rPr>
             <w:br/>
           </m:r>
         </m:oMath>
@@ -8835,6 +8907,9 @@
             </m:e>
           </m:d>
           <m:r>
+            <m:rPr>
+              <m:sty m:val="p"/>
+            </m:rPr>
             <w:rPr>
               <w:rFonts w:ascii="Cambria Math" w:hAnsi="Cambria Math" w:cs="Cambria Math"/>
             </w:rPr>
@@ -9098,6 +9173,9 @@
             </m:e>
           </m:d>
           <m:r>
+            <m:rPr>
+              <m:sty m:val="p"/>
+            </m:rPr>
             <w:rPr>
               <w:rFonts w:ascii="Cambria Math" w:hAnsi="Cambria Math" w:cs="Cambria Math"/>
             </w:rPr>
@@ -9438,6 +9516,9 @@
             </m:e>
           </m:d>
           <m:r>
+            <m:rPr>
+              <m:sty m:val="p"/>
+            </m:rPr>
             <w:rPr>
               <w:rFonts w:ascii="Cambria Math" w:hAnsi="Cambria Math" w:cs="Cambria Math"/>
             </w:rPr>
@@ -9711,6 +9792,9 @@
             </m:e>
           </m:d>
           <m:r>
+            <m:rPr>
+              <m:sty m:val="p"/>
+            </m:rPr>
             <w:rPr>
               <w:rFonts w:ascii="Cambria Math" w:hAnsi="Cambria Math" w:cs="Cambria Math"/>
             </w:rPr>
@@ -10464,6 +10548,9 @@
             </m:sup>
           </m:sSup>
           <m:r>
+            <m:rPr>
+              <m:sty m:val="p"/>
+            </m:rPr>
             <w:br/>
           </m:r>
         </m:oMath>
@@ -10651,6 +10738,9 @@
             <m:t>+⋯</m:t>
           </m:r>
           <m:r>
+            <m:rPr>
+              <m:sty m:val="p"/>
+            </m:rPr>
             <w:br/>
           </m:r>
         </m:oMath>
@@ -11873,6 +11963,9 @@
             </m:den>
           </m:f>
           <m:r>
+            <m:rPr>
+              <m:sty m:val="p"/>
+            </m:rPr>
             <w:rPr>
               <w:rFonts w:ascii="Cambria Math" w:hAnsi="Cambria Math" w:cs="Cambria Math"/>
             </w:rPr>
@@ -12664,6 +12757,9 @@
             </m:den>
           </m:f>
           <m:r>
+            <m:rPr>
+              <m:sty m:val="p"/>
+            </m:rPr>
             <w:rPr>
               <w:rFonts w:ascii="Cambria Math" w:hAnsi="Cambria Math" w:cs="Cambria Math"/>
             </w:rPr>
@@ -12935,7 +13031,57 @@
     </w:p>
     <w:p/>
     <w:p/>
-    <w:p/>
+    <w:p>
+      <w:pPr>
+        <w:rPr>
+          <w:rFonts w:hint="eastAsia"/>
+        </w:rPr>
+      </w:pPr>
+      <w:r>
+        <w:drawing>
+          <wp:inline distT="0" distB="0" distL="0" distR="0" wp14:anchorId="16986270" wp14:editId="6F052E96">
+            <wp:extent cx="4597400" cy="2336800"/>
+            <wp:effectExtent l="0" t="0" r="0" b="0"/>
+            <wp:docPr id="1920015981" name="圖片 1"/>
+            <wp:cNvGraphicFramePr>
+              <a:graphicFrameLocks xmlns:a="http://schemas.openxmlformats.org/drawingml/2006/main" noChangeAspect="1"/>
+            </wp:cNvGraphicFramePr>
+            <a:graphic xmlns:a="http://schemas.openxmlformats.org/drawingml/2006/main">
+              <a:graphicData uri="http://schemas.openxmlformats.org/drawingml/2006/picture">
+                <pic:pic xmlns:pic="http://schemas.openxmlformats.org/drawingml/2006/picture">
+                  <pic:nvPicPr>
+                    <pic:cNvPr id="1920015981" name=""/>
+                    <pic:cNvPicPr/>
+                  </pic:nvPicPr>
+                  <pic:blipFill>
+                    <a:blip r:embed="rId8"/>
+                    <a:stretch>
+                      <a:fillRect/>
+                    </a:stretch>
+                  </pic:blipFill>
+                  <pic:spPr>
+                    <a:xfrm>
+                      <a:off x="0" y="0"/>
+                      <a:ext cx="4597400" cy="2336800"/>
+                    </a:xfrm>
+                    <a:prstGeom prst="rect">
+                      <a:avLst/>
+                    </a:prstGeom>
+                  </pic:spPr>
+                </pic:pic>
+              </a:graphicData>
+            </a:graphic>
+          </wp:inline>
+        </w:drawing>
+      </w:r>
+    </w:p>
+    <w:p>
+      <w:pPr>
+        <w:rPr>
+          <w:rFonts w:hint="eastAsia"/>
+        </w:rPr>
+      </w:pPr>
+    </w:p>
     <w:p/>
     <w:p/>
     <w:p/>

</xml_diff>